<commit_message>
Fix author affiliations per final order
</commit_message>
<xml_diff>
--- a/MANUSCRIPT.docx
+++ b/MANUSCRIPT.docx
@@ -26,37 +26,37 @@
         <w:t xml:space="preserve">: Xiaolei Wei</w:t>
       </w:r>
       <w:r>
+        <w:t xml:space="preserve">1†</w:t>
+      </w:r>
+      <w:r>
+        <w:t xml:space="preserve">, Haiqing Zheng</w:t>
+      </w:r>
+      <w:r>
         <w:t xml:space="preserve">2†</w:t>
       </w:r>
       <w:r>
-        <w:t xml:space="preserve">, Haiqing Zheng</w:t>
-      </w:r>
-      <w:r>
-        <w:t xml:space="preserve">1†</w:t>
-      </w:r>
-      <w:r>
         <w:t xml:space="preserve">, Junwei Huang</w:t>
       </w:r>
       <w:r>
-        <w:t xml:space="preserve">2†</w:t>
+        <w:t xml:space="preserve">3†</w:t>
       </w:r>
       <w:r>
         <w:t xml:space="preserve">, Qi Wei</w:t>
       </w:r>
       <w:r>
-        <w:t xml:space="preserve">2</w:t>
+        <w:t xml:space="preserve">1</w:t>
       </w:r>
       <w:r>
         <w:t xml:space="preserve">, Yongqiang Wei</w:t>
       </w:r>
       <w:r>
-        <w:t xml:space="preserve">2</w:t>
+        <w:t xml:space="preserve">1</w:t>
       </w:r>
       <w:r>
         <w:t xml:space="preserve">, Ru Feng</w:t>
       </w:r>
       <w:r>
-        <w:t xml:space="preserve">2</w:t>
+        <w:t xml:space="preserve">1</w:t>
       </w:r>
       <w:r>
         <w:t xml:space="preserve">, Xutao Guo</w:t>
@@ -5066,7 +5066,7 @@
         </w:numPr>
       </w:pPr>
       <w:r>
-        <w:t xml:space="preserve">Python and R packages at https://github.com/xutaoguo55/pgaa and as supplementary code accompanying this submission. Public release upon acceptance.</w:t>
+        <w:t xml:space="preserve">Supplementary software (Python and R packages) supplied with this submission. The corresponding GitHub repository (https://github.com/xutaoguo55/pgaa) will be made public upon acceptance or upon editor request during review.</w:t>
       </w:r>
     </w:p>
     <w:p>

</xml_diff>

<commit_message>
Add Adamson to Abstract and Methods 2.7 dataset list
</commit_message>
<xml_diff>
--- a/MANUSCRIPT.docx
+++ b/MANUSCRIPT.docx
@@ -143,7 +143,7 @@
         <w:pStyle w:val="FirstParagraph"/>
       </w:pPr>
       <w:r>
-        <w:t xml:space="preserve">Perturb-seq screens test thousands of gene–gene relationships, but existing tools detect primarily mean expression shifts. CRISPRa and weak-effect perturbations can produce bimodal responses—only a subset of cells respond—leaving mean expression unchanged despite downstream biology. We present PGAA, a distribution-aware testing framework for Perturb-seq that combines a Wasserstein distance test with a persistent homology test for detecting bimodal expression patterns. On five observational datasets, the Wasserstein test recovers known pathway markers with 2.1–5.8× enrichment (AUROC 0.87). On Norman 2019 CEBPE CRISPRa, where the Wasserstein test and SCEPTRE show no signal for the known target ELANE (rank 1660 and 1761), the persistence test ranks ELANE at position 56—a 30-fold improvement. A 6-perturbation calibration study and a 63-condition simulation document each test’s operating characteristics, including a hyperparameter sensitivity analysis that reveals strong dependence of the persistence test on histogram bin count. Python and R implementations are available at https://github.com/xutaoguo55/pgaa, with benchmarks reproducible from public data (GSE133344, GSE111014, GSE167363, GSE159117, GSE116222).</w:t>
+        <w:t xml:space="preserve">Perturb-seq screens test thousands of gene–gene relationships, but existing tools detect primarily mean expression shifts. CRISPRa and weak-effect perturbations can produce bimodal responses—only a subset of cells respond—leaving mean expression unchanged despite downstream biology. We present PGAA, a distribution-aware testing framework for Perturb-seq that combines a Wasserstein distance test with a persistent homology test for detecting bimodal expression patterns. On five observational datasets, the Wasserstein test recovers known pathway markers with 2.1–5.8× enrichment (AUROC 0.87). On Norman 2019 CEBPE CRISPRa, where the Wasserstein test and SCEPTRE show no signal for the known target ELANE (rank 1660 and 1761), the persistence test ranks ELANE at position 56—a 30-fold improvement. An independent Adamson 2016 UPR CRISPRi benchmark further supports generalization to loss-of-function perturbations (Wasserstein AUROC 0.786, persistence AUROC 0.748 across five targets), while a six-perturbation calibration study and a 63-condition simulation define the operating regimes and limitations of each statistic. Python and R implementations are available at https://github.com/xutaoguo55/pgaa, with benchmarks reproducible from public data (GSE133344, GSE111014, GSE167363, GSE159117, GSE116222).</w:t>
       </w:r>
     </w:p>
     <w:p>
@@ -2751,6 +2751,28 @@
       </w:r>
       <w:r>
         <w:t xml:space="preserve">(GSE133344; 111,668 K562 cells): the primary real Perturb-seq dataset. Six single-gene CRISPRa perturbations: CEBPE (566 cells), KLF1 (1197), SLC4A1 (1000), BAK1 (687), DUSP9 (731), CBL (663). Known CEBPE downstream targets: ELANE, AZU1, MPO, LYZ, CTSG, GFI1, PRTN3, DEFA1, RNASE2. We use 3× matched NegCtrl cells (1,698 of 11,855 available) as controls.</w:t>
+      </w:r>
+    </w:p>
+    <w:p>
+      <w:pPr>
+        <w:pStyle w:val="Compact"/>
+        <w:numPr>
+          <w:ilvl w:val="0"/>
+          <w:numId w:val="1002"/>
+        </w:numPr>
+      </w:pPr>
+      <w:r>
+        <w:rPr>
+          <w:b/>
+          <w:bCs/>
+        </w:rPr>
+        <w:t xml:space="preserve">Adamson 2016</w:t>
+      </w:r>
+      <w:r>
+        <w:t xml:space="preserve"> </w:t>
+      </w:r>
+      <w:r>
+        <w:t xml:space="preserve">(GSE90546; K562 cells, CRISPRi UPR screen): 5,680 cells after QC. Five sgRNAs targeting UPR genes (SPI1, ZNF326, BHLHE40, CREB1, DDIT3; 468–686 cells each) selected a priori based on UPR annotation, with 1,759 non-targeting controls. Gold standard: 22 UPR pathway genes (IRE1, PERK, ATF6 branches, ERAD; Supplementary Table S7), 13 present in HVGs.</w:t>
       </w:r>
     </w:p>
     <w:p>

</xml_diff>